<commit_message>
docs: Update final report with verified GitHub commit hash and Drive link
</commit_message>
<xml_diff>
--- a/ParkSense_Final_Report_Updated.docx
+++ b/ParkSense_Final_Report_Updated.docx
@@ -253,7 +253,7 @@
                 <w:color w:val="1E293B"/>
                 <w:sz w:val="18"/>
               </w:rPr>
-              <w:t>https://github.com/keshav2608kumar/embedded  (Verified Commit: f2d4501)</w:t>
+              <w:t>https://github.com/keshav2608kumar/embedded  (Verified Commit: 76ad359)</w:t>
             </w:r>
           </w:p>
         </w:tc>
@@ -14747,7 +14747,7 @@
           <w:b w:val="0"/>
           <w:i w:val="0"/>
         </w:rPr>
-        <w:t>Repository Commitment: All source code, test suites, and models are version-controlled in the project Git repository (https://github.com/keshav2608kumar/embedded) under commit hash f2d4501.</w:t>
+        <w:t>Repository Commitment: All source code, test suites, and models are version-controlled in the project Git repository (https://github.com/keshav2608kumar/embedded) under commit hash 76ad359.</w:t>
       </w:r>
     </w:p>
     <w:p>

</xml_diff>